<commit_message>
Fixed small bit of text.
</commit_message>
<xml_diff>
--- a/Documentation/FunctionalSpecification-IdleReservations.docx
+++ b/Documentation/FunctionalSpecification-IdleReservations.docx
@@ -82,7 +82,6 @@
         </w:rPr>
         <w:t xml:space="preserve"> </w:t>
       </w:r>
-      <w:proofErr w:type="spellStart"/>
       <w:r>
         <w:rPr>
           <w:rFonts w:ascii="Segoe UI" w:hAnsi="Segoe UI" w:cs="Segoe UI"/>
@@ -91,9 +90,8 @@
           <w:sz w:val="32"/>
           <w:szCs w:val="32"/>
         </w:rPr>
-        <w:t>Idle</w:t>
-      </w:r>
-      <w:proofErr w:type="spellEnd"/>
+        <w:t>Idle Reservation</w:t>
+      </w:r>
       <w:r>
         <w:rPr>
           <w:rFonts w:ascii="Segoe UI" w:hAnsi="Segoe UI" w:cs="Segoe UI"/>
@@ -102,30 +100,8 @@
           <w:sz w:val="32"/>
           <w:szCs w:val="32"/>
         </w:rPr>
-        <w:t xml:space="preserve"> </w:t>
-      </w:r>
-      <w:proofErr w:type="spellStart"/>
-      <w:r>
-        <w:rPr>
-          <w:rFonts w:ascii="Segoe UI" w:hAnsi="Segoe UI" w:cs="Segoe UI"/>
-          <w:b/>
-          <w:color w:val="333333"/>
-          <w:sz w:val="32"/>
-          <w:szCs w:val="32"/>
-        </w:rPr>
-        <w:t>Reservation</w:t>
-      </w:r>
-      <w:r>
-        <w:rPr>
-          <w:rFonts w:ascii="Segoe UI" w:hAnsi="Segoe UI" w:cs="Segoe UI"/>
-          <w:b/>
-          <w:color w:val="333333"/>
-          <w:sz w:val="32"/>
-          <w:szCs w:val="32"/>
-        </w:rPr>
         <w:t>s</w:t>
       </w:r>
-      <w:proofErr w:type="spellEnd"/>
     </w:p>
     <w:p>
       <w:pPr>
@@ -2306,24 +2282,14 @@
         <w:t xml:space="preserve">, </w:t>
       </w:r>
       <w:r>
-        <w:t xml:space="preserve">Luka </w:t>
-      </w:r>
-      <w:proofErr w:type="spellStart"/>
-      <w:r>
-        <w:t>Domikulić</w:t>
-      </w:r>
-      <w:proofErr w:type="spellEnd"/>
+        <w:t>Luka Domikulić</w:t>
+      </w:r>
       <w:r>
         <w:t xml:space="preserve"> i </w:t>
       </w:r>
       <w:r>
-        <w:t xml:space="preserve">Musa </w:t>
-      </w:r>
-      <w:proofErr w:type="spellStart"/>
-      <w:r>
-        <w:t>Mah'D</w:t>
-      </w:r>
-      <w:proofErr w:type="spellEnd"/>
+        <w:t>Musa Mah'D</w:t>
+      </w:r>
       <w:r>
         <w:t>.</w:t>
       </w:r>
@@ -2400,19 +2366,11 @@
           <w:lang w:eastAsia="hr-HR"/>
         </w:rPr>
       </w:pPr>
-      <w:proofErr w:type="spellStart"/>
       <w:r>
         <w:rPr>
           <w:lang w:eastAsia="hr-HR"/>
         </w:rPr>
-        <w:t>Backend</w:t>
-      </w:r>
-      <w:proofErr w:type="spellEnd"/>
-      <w:r>
-        <w:rPr>
-          <w:lang w:eastAsia="hr-HR"/>
-        </w:rPr>
-        <w:t xml:space="preserve"> sloja koji obrađuje poslovnu logiku.</w:t>
+        <w:t>Backend sloja koji obrađuje poslovnu logiku.</w:t>
       </w:r>
     </w:p>
     <w:p>
@@ -2463,35 +2421,7 @@
         <w:rPr>
           <w:lang w:eastAsia="hr-HR"/>
         </w:rPr>
-        <w:t xml:space="preserve">Integracije s Google </w:t>
-      </w:r>
-      <w:proofErr w:type="spellStart"/>
-      <w:r>
-        <w:rPr>
-          <w:lang w:eastAsia="hr-HR"/>
-        </w:rPr>
-        <w:t>Maps</w:t>
-      </w:r>
-      <w:proofErr w:type="spellEnd"/>
-      <w:r>
-        <w:rPr>
-          <w:lang w:eastAsia="hr-HR"/>
-        </w:rPr>
-        <w:t xml:space="preserve"> API-</w:t>
-      </w:r>
-      <w:proofErr w:type="spellStart"/>
-      <w:r>
-        <w:rPr>
-          <w:lang w:eastAsia="hr-HR"/>
-        </w:rPr>
-        <w:t>jem</w:t>
-      </w:r>
-      <w:proofErr w:type="spellEnd"/>
-      <w:r>
-        <w:rPr>
-          <w:lang w:eastAsia="hr-HR"/>
-        </w:rPr>
-        <w:t xml:space="preserve"> za prikaz lokacija restorana.</w:t>
+        <w:t>Integracije s Google Maps API-jem za prikaz lokacija restorana.</w:t>
       </w:r>
     </w:p>
     <w:p>
@@ -2627,35 +2557,7 @@
         <w:rPr>
           <w:lang w:eastAsia="hr-HR"/>
         </w:rPr>
-        <w:t xml:space="preserve">Pojmovi u projektu su: naručitelj, izvođač, administrator, korisnik, program lojalnosti, rezervacija, Google </w:t>
-      </w:r>
-      <w:proofErr w:type="spellStart"/>
-      <w:r>
-        <w:rPr>
-          <w:lang w:eastAsia="hr-HR"/>
-        </w:rPr>
-        <w:t>Maps</w:t>
-      </w:r>
-      <w:proofErr w:type="spellEnd"/>
-      <w:r>
-        <w:rPr>
-          <w:lang w:eastAsia="hr-HR"/>
-        </w:rPr>
-        <w:t xml:space="preserve"> integracija, </w:t>
-      </w:r>
-      <w:proofErr w:type="spellStart"/>
-      <w:r>
-        <w:rPr>
-          <w:lang w:eastAsia="hr-HR"/>
-        </w:rPr>
-        <w:t>push</w:t>
-      </w:r>
-      <w:proofErr w:type="spellEnd"/>
-      <w:r>
-        <w:rPr>
-          <w:lang w:eastAsia="hr-HR"/>
-        </w:rPr>
-        <w:t xml:space="preserve"> obavijesti, sigurnost podataka.</w:t>
+        <w:t>Pojmovi u projektu su: naručitelj, izvođač, administrator, korisnik, program lojalnosti, rezervacija, Google Maps integracija, push obavijesti, sigurnost podataka.</w:t>
       </w:r>
     </w:p>
     <w:p>
@@ -2704,35 +2606,7 @@
         <w:rPr>
           <w:lang w:eastAsia="hr-HR"/>
         </w:rPr>
-        <w:t xml:space="preserve"> je studentski tim (Filip Folnegović, Musa </w:t>
-      </w:r>
-      <w:proofErr w:type="spellStart"/>
-      <w:r>
-        <w:rPr>
-          <w:lang w:eastAsia="hr-HR"/>
-        </w:rPr>
-        <w:t>Mah'D</w:t>
-      </w:r>
-      <w:proofErr w:type="spellEnd"/>
-      <w:r>
-        <w:rPr>
-          <w:lang w:eastAsia="hr-HR"/>
-        </w:rPr>
-        <w:t xml:space="preserve">, Luka </w:t>
-      </w:r>
-      <w:proofErr w:type="spellStart"/>
-      <w:r>
-        <w:rPr>
-          <w:lang w:eastAsia="hr-HR"/>
-        </w:rPr>
-        <w:t>Domikulić</w:t>
-      </w:r>
-      <w:proofErr w:type="spellEnd"/>
-      <w:r>
-        <w:rPr>
-          <w:lang w:eastAsia="hr-HR"/>
-        </w:rPr>
-        <w:t xml:space="preserve"> i Luka Markota).</w:t>
+        <w:t xml:space="preserve"> je studentski tim (Filip Folnegović, Musa Mah'D, Luka Domikulić i Luka Markota).</w:t>
       </w:r>
     </w:p>
     <w:p>
@@ -2753,7 +2627,19 @@
         <w:rPr>
           <w:lang w:eastAsia="hr-HR"/>
         </w:rPr>
-        <w:t xml:space="preserve"> - osoba odgovorna za upravljanje aplikacijom i njezinim sadržajem, uključujući ažuriranje jelovnika, cijena, informacija o lokacijama restorana te pregled i upravljanje rezervacijama.</w:t>
+        <w:t xml:space="preserve"> - osoba odgovorna za upravljanje aplikacijom i njezinim sadržajem, uključujući ažuriranje </w:t>
+      </w:r>
+      <w:r>
+        <w:rPr>
+          <w:lang w:eastAsia="hr-HR"/>
+        </w:rPr>
+        <w:t xml:space="preserve">notifikacija, </w:t>
+      </w:r>
+      <w:r>
+        <w:rPr>
+          <w:lang w:eastAsia="hr-HR"/>
+        </w:rPr>
+        <w:t>informacija o lokacijama restorana te pregled i upravljanje rezervacijama.</w:t>
       </w:r>
     </w:p>
     <w:p>
@@ -2838,56 +2724,28 @@
           <w:bCs/>
           <w:lang w:eastAsia="hr-HR"/>
         </w:rPr>
-        <w:t xml:space="preserve">Google </w:t>
-      </w:r>
-      <w:proofErr w:type="spellStart"/>
+        <w:t>Google Maps integracija</w:t>
+      </w:r>
+      <w:r>
+        <w:rPr>
+          <w:lang w:eastAsia="hr-HR"/>
+        </w:rPr>
+        <w:t>: korištenje Googleovih kartografskih usluga za prikaz točnih lokacija restorana, radnog vremena i pružanje navigacije korisniku.</w:t>
+      </w:r>
+    </w:p>
+    <w:p>
+      <w:pPr>
+        <w:rPr>
+          <w:lang w:eastAsia="hr-HR"/>
+        </w:rPr>
+      </w:pPr>
       <w:r>
         <w:rPr>
           <w:b/>
           <w:bCs/>
           <w:lang w:eastAsia="hr-HR"/>
         </w:rPr>
-        <w:t>Maps</w:t>
-      </w:r>
-      <w:proofErr w:type="spellEnd"/>
-      <w:r>
-        <w:rPr>
-          <w:b/>
-          <w:bCs/>
-          <w:lang w:eastAsia="hr-HR"/>
-        </w:rPr>
-        <w:t xml:space="preserve"> integracija</w:t>
-      </w:r>
-      <w:r>
-        <w:rPr>
-          <w:lang w:eastAsia="hr-HR"/>
-        </w:rPr>
-        <w:t>: korištenje Googleovih kartografskih usluga za prikaz točnih lokacija restorana, radnog vremena i pružanje navigacije korisniku.</w:t>
-      </w:r>
-    </w:p>
-    <w:p>
-      <w:pPr>
-        <w:rPr>
-          <w:lang w:eastAsia="hr-HR"/>
-        </w:rPr>
-      </w:pPr>
-      <w:proofErr w:type="spellStart"/>
-      <w:r>
-        <w:rPr>
-          <w:b/>
-          <w:bCs/>
-          <w:lang w:eastAsia="hr-HR"/>
-        </w:rPr>
-        <w:t>Push</w:t>
-      </w:r>
-      <w:proofErr w:type="spellEnd"/>
-      <w:r>
-        <w:rPr>
-          <w:b/>
-          <w:bCs/>
-          <w:lang w:eastAsia="hr-HR"/>
-        </w:rPr>
-        <w:t xml:space="preserve"> obavijesti</w:t>
+        <w:t>Push obavijesti</w:t>
       </w:r>
       <w:r>
         <w:rPr>
@@ -2976,21 +2834,7 @@
         <w:rPr>
           <w:lang w:eastAsia="hr-HR"/>
         </w:rPr>
-        <w:t>Projekt je fokusiran na razvoj integrirane web i mobilne aplikacije za upravljanje lancem restorana, dok razvoj zasebne desktop aplikacije ili terminala za samostalno naručivanje u restoranu nije obuhvaćen. Iako sustav omogućuje pregled jelovnika i rezervaciju stolova, aplikacija u ovoj fazi ne podržava izravno plaćanje računa (e-</w:t>
-      </w:r>
-      <w:proofErr w:type="spellStart"/>
-      <w:r>
-        <w:rPr>
-          <w:lang w:eastAsia="hr-HR"/>
-        </w:rPr>
-        <w:t>commerce</w:t>
-      </w:r>
-      <w:proofErr w:type="spellEnd"/>
-      <w:r>
-        <w:rPr>
-          <w:lang w:eastAsia="hr-HR"/>
-        </w:rPr>
-        <w:t xml:space="preserve"> funkcionalnosti) niti integraciju s vanjskim servisima za dostavu hrane. Također, nije predviđena napredna integracija s društvenim mrežama izvan osnovnih opcija dijeljenja lokacije ili ponude. Naglasak je stavljen na osnovne poslovne procese poput rezervacija i lojalnosti, dok će se dodatne mogućnosti poput modula za inventuru ili naprednog upravljanja radnim smjenama osoblja razmatrati samo ako vremenski okvir nakon primarne implementacije to dopusti.</w:t>
+        <w:t>Projekt je fokusiran na razvoj integrirane web i mobilne aplikacije za upravljanje lancem restorana, dok razvoj zasebne desktop aplikacije ili terminala za samostalno naručivanje u restoranu nije obuhvaćen. Iako sustav omogućuje pregled jelovnika i rezervaciju stolova, aplikacija u ovoj fazi ne podržava izravno plaćanje računa (e-commerce funkcionalnosti) niti integraciju s vanjskim servisima za dostavu hrane. Također, nije predviđena napredna integracija s društvenim mrežama izvan osnovnih opcija dijeljenja lokacije ili ponude. Naglasak je stavljen na osnovne poslovne procese poput rezervacija i lojalnosti, dok će se dodatne mogućnosti poput modula za inventuru ili naprednog upravljanja radnim smjenama osoblja razmatrati samo ako vremenski okvir nakon primarne implementacije to dopusti.</w:t>
       </w:r>
     </w:p>
     <w:p>
@@ -3030,49 +2874,7 @@
         <w:rPr>
           <w:lang w:eastAsia="hr-HR"/>
         </w:rPr>
-        <w:t xml:space="preserve">Uspješna realizacija projekta pretpostavlja stabilnu internetsku vezu na strani korisnika i restorana radi sinkronizacije podataka u stvarnom vremenu. Razvoj se oslanja na dostupnost Google </w:t>
-      </w:r>
-      <w:proofErr w:type="spellStart"/>
-      <w:r>
-        <w:rPr>
-          <w:lang w:eastAsia="hr-HR"/>
-        </w:rPr>
-        <w:t>Maps</w:t>
-      </w:r>
-      <w:proofErr w:type="spellEnd"/>
-      <w:r>
-        <w:rPr>
-          <w:lang w:eastAsia="hr-HR"/>
-        </w:rPr>
-        <w:t xml:space="preserve"> API servisa te stabilnost hosting infrastrukture na kojoj će se nalaziti </w:t>
-      </w:r>
-      <w:proofErr w:type="spellStart"/>
-      <w:r>
-        <w:rPr>
-          <w:lang w:eastAsia="hr-HR"/>
-        </w:rPr>
-        <w:t>backend</w:t>
-      </w:r>
-      <w:proofErr w:type="spellEnd"/>
-      <w:r>
-        <w:rPr>
-          <w:lang w:eastAsia="hr-HR"/>
-        </w:rPr>
-        <w:t xml:space="preserve"> i baza podataka. Projekt će se razvijati agilnom metodologijom, što podrazumijeva redovito testiranje i prilagodbu na temelju povratnih informacija. Ključna ovisnost je odobrenje funkcionalnosti od strane naručitelja (profesora), pri čemu su moguće izmjene u opsegu rada i planiranim datumima isporuke ako se procijeni da je potrebno dodati ili izmijeniti određene dijelove sustava radi postizanja ishoda učenja. Pretpostavlja se da će krajnji korisnici posjedovati pametne telefone koji podržavaju suvremene web standarde i </w:t>
-      </w:r>
-      <w:proofErr w:type="spellStart"/>
-      <w:r>
-        <w:rPr>
-          <w:lang w:eastAsia="hr-HR"/>
-        </w:rPr>
-        <w:t>notifikacijske</w:t>
-      </w:r>
-      <w:proofErr w:type="spellEnd"/>
-      <w:r>
-        <w:rPr>
-          <w:lang w:eastAsia="hr-HR"/>
-        </w:rPr>
-        <w:t xml:space="preserve"> servise.</w:t>
+        <w:t>Uspješna realizacija projekta pretpostavlja stabilnu internetsku vezu na strani korisnika i restorana radi sinkronizacije podataka u stvarnom vremenu. Razvoj se oslanja na dostupnost Google Maps API servisa te stabilnost hosting infrastrukture na kojoj će se nalaziti backend i baza podataka. Projekt će se razvijati agilnom metodologijom, što podrazumijeva redovito testiranje i prilagodbu na temelju povratnih informacija. Ključna ovisnost je odobrenje funkcionalnosti od strane naručitelja (profesora), pri čemu su moguće izmjene u opsegu rada i planiranim datumima isporuke ako se procijeni da je potrebno dodati ili izmijeniti određene dijelove sustava radi postizanja ishoda učenja. Pretpostavlja se da će krajnji korisnici posjedovati pametne telefone koji podržavaju suvremene web standarde i notifikacijske servise.</w:t>
       </w:r>
     </w:p>
     <w:p>
@@ -3202,7 +3004,13 @@
         <w:t>F05:</w:t>
       </w:r>
       <w:r>
-        <w:t xml:space="preserve"> Administrator mora imati mogućnost dodavanja/brisanja artikala iz jelovnika.</w:t>
+        <w:t xml:space="preserve"> Administrator mora imati mogućnost </w:t>
+      </w:r>
+      <w:r>
+        <w:t>reguliranja rezervacija</w:t>
+      </w:r>
+      <w:r>
+        <w:t>.</w:t>
       </w:r>
     </w:p>
     <w:p>
@@ -3215,15 +3023,7 @@
         <w:t>F06:</w:t>
       </w:r>
       <w:r>
-        <w:t xml:space="preserve"> Sustav mora slati </w:t>
-      </w:r>
-      <w:proofErr w:type="spellStart"/>
-      <w:r>
-        <w:t>push</w:t>
-      </w:r>
-      <w:proofErr w:type="spellEnd"/>
-      <w:r>
-        <w:t xml:space="preserve"> ili email notifikacije korisniku (potvrda rezervacije, novi popusti).</w:t>
+        <w:t xml:space="preserve"> Sustav mora slati push ili email notifikacije korisniku (potvrda rezervacije, novi popusti).</w:t>
       </w:r>
     </w:p>
     <w:p/>
@@ -3390,21 +3190,7 @@
         <w:rPr>
           <w:rFonts w:eastAsia="Verdana" w:cs="Verdana"/>
         </w:rPr>
-        <w:t>Sustav primarno osigurava sigurnu autentifikaciju korisnika putem emaila i lozinke, pri čemu se lozinke obavezno kriptiraju upotrebom modernih "</w:t>
-      </w:r>
-      <w:proofErr w:type="spellStart"/>
-      <w:r>
-        <w:rPr>
-          <w:rFonts w:eastAsia="Verdana" w:cs="Verdana"/>
-        </w:rPr>
-        <w:t>hashing</w:t>
-      </w:r>
-      <w:proofErr w:type="spellEnd"/>
-      <w:r>
-        <w:rPr>
-          <w:rFonts w:eastAsia="Verdana" w:cs="Verdana"/>
-        </w:rPr>
-        <w:t>" algoritama radi sprečavanja zlouporabe podataka, što je izravno usklađeno s ishodom učenja LO3. Unutar sustava definirane su različite korisničke uloge koje kontroliraju razinu pristupa podacima, dok mobilna aplikacija koristi tokene za održavanje aktivne prijave.</w:t>
+        <w:t>Sustav primarno osigurava sigurnu autentifikaciju korisnika putem emaila i lozinke, pri čemu se lozinke obavezno kriptiraju upotrebom modernih "hashing" algoritama radi sprečavanja zlouporabe podataka, što je izravno usklađeno s ishodom učenja LO3. Unutar sustava definirane su različite korisničke uloge koje kontroliraju razinu pristupa podacima, dok mobilna aplikacija koristi tokene za održavanje aktivne prijave.</w:t>
       </w:r>
     </w:p>
     <w:p>
@@ -3444,35 +3230,7 @@
         <w:rPr>
           <w:rFonts w:eastAsia="Verdana" w:cs="Verdana"/>
         </w:rPr>
-        <w:t xml:space="preserve">Vizualni pregled lanca restorana osiguran je integracijom Google </w:t>
-      </w:r>
-      <w:proofErr w:type="spellStart"/>
-      <w:r>
-        <w:rPr>
-          <w:rFonts w:eastAsia="Verdana" w:cs="Verdana"/>
-        </w:rPr>
-        <w:t>Maps</w:t>
-      </w:r>
-      <w:proofErr w:type="spellEnd"/>
-      <w:r>
-        <w:rPr>
-          <w:rFonts w:eastAsia="Verdana" w:cs="Verdana"/>
-        </w:rPr>
-        <w:t xml:space="preserve"> API-ja koji prikazuje interaktivne markere s informacijama o radnom vremenu i navigaciji. Cijeli proces prati automatizirani </w:t>
-      </w:r>
-      <w:proofErr w:type="spellStart"/>
-      <w:r>
-        <w:rPr>
-          <w:rFonts w:eastAsia="Verdana" w:cs="Verdana"/>
-        </w:rPr>
-        <w:t>notifikacijski</w:t>
-      </w:r>
-      <w:proofErr w:type="spellEnd"/>
-      <w:r>
-        <w:rPr>
-          <w:rFonts w:eastAsia="Verdana" w:cs="Verdana"/>
-        </w:rPr>
-        <w:t xml:space="preserve"> sustav koji na temelju vremenskih okidača šalje potvrde rezervacija i podsjetnike korisnicima, dok administratorima omogućuje slanje masovnih obavijesti o novim promocijama svim članovima kluba vjernosti.</w:t>
+        <w:t>Vizualni pregled lanca restorana osiguran je integracijom Google Maps API-ja koji prikazuje interaktivne markere s informacijama o radnom vremenu i navigaciji. Cijeli proces prati automatizirani notifikacijski sustav koji na temelju vremenskih okidača šalje potvrde rezervacija i podsjetnike korisnicima, dok administratorima omogućuje slanje masovnih obavijesti o novim promocijama svim članovima kluba vjernosti.</w:t>
       </w:r>
     </w:p>
     <w:p>
@@ -3508,29 +3266,13 @@
     <w:p/>
     <w:p>
       <w:r>
-        <w:t xml:space="preserve">Sigurnost sustava temelji se na obaveznoj HTTPS enkripciji sve komunikacije između klijentskih aplikacija i servera, uz dodatnu zaštitu osobnih podataka korisnika od neovlaštenog pristupa. Administratorsko sučelje posebno je izolirano kako bi se osigurao integritet poslovnih podataka. Sustav je projektiran za visoku dostupnost od 99.9% i optimiziran je za brzi odziv, gdje </w:t>
-      </w:r>
-      <w:proofErr w:type="spellStart"/>
-      <w:r>
-        <w:t>backend</w:t>
-      </w:r>
-      <w:proofErr w:type="spellEnd"/>
-      <w:r>
-        <w:t xml:space="preserve"> API obrađuje zahtjeve u manje od 200ms, osiguravajući fluidno iskustvo čak i pri slabijoj mobilnoj vezi.</w:t>
+        <w:t>Sigurnost sustava temelji se na obaveznoj HTTPS enkripciji sve komunikacije između klijentskih aplikacija i servera, uz dodatnu zaštitu osobnih podataka korisnika od neovlaštenog pristupa. Administratorsko sučelje posebno je izolirano kako bi se osigurao integritet poslovnih podataka. Sustav je projektiran za visoku dostupnost od 99.9% i optimiziran je za brzi odziv, gdje backend API obrađuje zahtjeve u manje od 200ms, osiguravajući fluidno iskustvo čak i pri slabijoj mobilnoj vezi.</w:t>
       </w:r>
     </w:p>
     <w:p/>
     <w:p>
       <w:r>
-        <w:t xml:space="preserve">Korisničko iskustvo stavlja naglasak na intuitivnost, omogućujući završetak rezervacije u maksimalno četiri klika kroz </w:t>
-      </w:r>
-      <w:proofErr w:type="spellStart"/>
-      <w:r>
-        <w:t>responzivni</w:t>
-      </w:r>
-      <w:proofErr w:type="spellEnd"/>
-      <w:r>
-        <w:t xml:space="preserve"> dizajn prilagođen svim veličinama ekrana. Arhitektura je u potpunosti skalabilna i modularna, što omogućuje jednostavno dodavanje novih restorana u bazu bez promjena u izvornom kodu, uz stabilan rad sustava čak i tijekom vršnih opterećenja i blagdanskih perioda kada se očekuje značajno povećan broj istovremenih korisnika.</w:t>
+        <w:t>Korisničko iskustvo stavlja naglasak na intuitivnost, omogućujući završetak rezervacije u maksimalno četiri klika kroz responzivni dizajn prilagođen svim veličinama ekrana. Arhitektura je u potpunosti skalabilna i modularna, što omogućuje jednostavno dodavanje novih restorana u bazu bez promjena u izvornom kodu, uz stabilan rad sustava čak i tijekom vršnih opterećenja i blagdanskih perioda kada se očekuje značajno povećan broj istovremenih korisnika.</w:t>
       </w:r>
     </w:p>
     <w:p/>
@@ -3614,15 +3356,7 @@
         <w:t>Tehnički rizik:</w:t>
       </w:r>
       <w:r>
-        <w:t xml:space="preserve"> Problemi s integracijom vanjskih servisa (Google </w:t>
-      </w:r>
-      <w:proofErr w:type="spellStart"/>
-      <w:r>
-        <w:t>Maps</w:t>
-      </w:r>
-      <w:proofErr w:type="spellEnd"/>
-      <w:r>
-        <w:t xml:space="preserve"> API).</w:t>
+        <w:t xml:space="preserve"> Problemi s integracijom vanjskih servisa (Google Maps API).</w:t>
       </w:r>
     </w:p>
     <w:p>
@@ -3658,15 +3392,7 @@
         <w:t>Operativni rizik:</w:t>
       </w:r>
       <w:r>
-        <w:t xml:space="preserve"> Kašnjenje u izradi mobilne aplikacije zbog kompleksnosti sinkronizacije s </w:t>
-      </w:r>
-      <w:proofErr w:type="spellStart"/>
-      <w:r>
-        <w:t>backendom</w:t>
-      </w:r>
-      <w:proofErr w:type="spellEnd"/>
-      <w:r>
-        <w:t>.</w:t>
+        <w:t xml:space="preserve"> Kašnjenje u izradi mobilne aplikacije zbog kompleksnosti sinkronizacije s backendom.</w:t>
       </w:r>
     </w:p>
     <w:sectPr>
@@ -3891,32 +3617,13 @@
             </w:rPr>
             <w:t xml:space="preserve">Projekt </w:t>
           </w:r>
-          <w:proofErr w:type="spellStart"/>
           <w:r>
             <w:rPr>
               <w:rFonts w:ascii="Segoe UI" w:hAnsi="Segoe UI" w:cs="Segoe UI"/>
               <w:sz w:val="22"/>
               <w:szCs w:val="22"/>
             </w:rPr>
-            <w:t>Idle</w:t>
-          </w:r>
-          <w:proofErr w:type="spellEnd"/>
-          <w:r>
-            <w:rPr>
-              <w:rFonts w:ascii="Segoe UI" w:hAnsi="Segoe UI" w:cs="Segoe UI"/>
-              <w:sz w:val="22"/>
-              <w:szCs w:val="22"/>
-            </w:rPr>
-            <w:t xml:space="preserve"> </w:t>
-          </w:r>
-          <w:proofErr w:type="spellStart"/>
-          <w:r>
-            <w:rPr>
-              <w:rFonts w:ascii="Segoe UI" w:hAnsi="Segoe UI" w:cs="Segoe UI"/>
-              <w:sz w:val="22"/>
-              <w:szCs w:val="22"/>
-            </w:rPr>
-            <w:t>Reservation</w:t>
+            <w:t>Idle Reservation</w:t>
           </w:r>
           <w:r>
             <w:rPr>
@@ -3926,7 +3633,6 @@
             </w:rPr>
             <w:t>s</w:t>
           </w:r>
-          <w:proofErr w:type="spellEnd"/>
         </w:p>
       </w:tc>
     </w:tr>
@@ -10775,6 +10481,7 @@
   <w:style w:type="character" w:default="1" w:styleId="DefaultParagraphFont">
     <w:name w:val="Default Paragraph Font"/>
     <w:uiPriority w:val="1"/>
+    <w:semiHidden/>
     <w:unhideWhenUsed/>
   </w:style>
   <w:style w:type="table" w:default="1" w:styleId="TableNormal">
@@ -12062,25 +11769,6 @@
 </file>
 
 <file path=customXml/item1.xml><?xml version="1.0" encoding="utf-8"?>
-<?mso-contentType ?>
-<FormTemplates xmlns="http://schemas.microsoft.com/sharepoint/v3/contenttype/forms">
-  <Display>DocumentLibraryForm</Display>
-  <Edit>DocumentLibraryForm</Edit>
-  <New>DocumentLibraryForm</New>
-</FormTemplates>
-</file>
-
-<file path=customXml/item2.xml><?xml version="1.0" encoding="utf-8"?>
-<p:properties xmlns:p="http://schemas.microsoft.com/office/2006/metadata/properties" xmlns:xsi="http://www.w3.org/2001/XMLSchema-instance" xmlns:pc="http://schemas.microsoft.com/office/infopath/2007/PartnerControls">
-  <documentManagement/>
-</p:properties>
-</file>
-
-<file path=customXml/item3.xml><?xml version="1.0" encoding="utf-8"?>
-<b:Sources xmlns:b="http://schemas.openxmlformats.org/officeDocument/2006/bibliography" xmlns="http://schemas.openxmlformats.org/officeDocument/2006/bibliography" SelectedStyle="\APASixthEditionOfficeOnline.xsl" StyleName="APA" Version="6"/>
-</file>
-
-<file path=customXml/item4.xml><?xml version="1.0" encoding="utf-8"?>
 <ct:contentTypeSchema xmlns:ct="http://schemas.microsoft.com/office/2006/metadata/contentType" xmlns:ma="http://schemas.microsoft.com/office/2006/metadata/properties/metaAttributes" ct:_="" ma:_="" ma:contentTypeName="Document" ma:contentTypeID="0x010100D4070514AF8B894AAF24DC61CC15240C" ma:contentTypeVersion="5" ma:contentTypeDescription="Create a new document." ma:contentTypeScope="" ma:versionID="f3eab86a50c786cd3ffdf45d92b52c7d">
   <xsd:schema xmlns:xsd="http://www.w3.org/2001/XMLSchema" xmlns:xs="http://www.w3.org/2001/XMLSchema" xmlns:p="http://schemas.microsoft.com/office/2006/metadata/properties" xmlns:ns2="1963049f-dc55-4499-ba4e-c842acd26adc" targetNamespace="http://schemas.microsoft.com/office/2006/metadata/properties" ma:root="true" ma:fieldsID="f5844bce3e6b3398d31ec99572ef9b21" ns2:_="">
     <xsd:import namespace="1963049f-dc55-4499-ba4e-c842acd26adc"/>
@@ -12230,32 +11918,26 @@
 </ct:contentTypeSchema>
 </file>
 
-<file path=customXml/itemProps1.xml><?xml version="1.0" encoding="utf-8"?>
-<ds:datastoreItem xmlns:ds="http://schemas.openxmlformats.org/officeDocument/2006/customXml" ds:itemID="{0276D1CE-9307-4AF3-A975-339D2B4EFB7C}">
-  <ds:schemaRefs>
-    <ds:schemaRef ds:uri="http://schemas.microsoft.com/sharepoint/v3/contenttype/forms"/>
-  </ds:schemaRefs>
-</ds:datastoreItem>
+<file path=customXml/item2.xml><?xml version="1.0" encoding="utf-8"?>
+<b:Sources xmlns:b="http://schemas.openxmlformats.org/officeDocument/2006/bibliography" xmlns="http://schemas.openxmlformats.org/officeDocument/2006/bibliography" SelectedStyle="\APASixthEditionOfficeOnline.xsl" StyleName="APA" Version="6"/>
 </file>
 
-<file path=customXml/itemProps2.xml><?xml version="1.0" encoding="utf-8"?>
-<ds:datastoreItem xmlns:ds="http://schemas.openxmlformats.org/officeDocument/2006/customXml" ds:itemID="{537FCB90-352A-4115-8519-7DBF373A0991}">
-  <ds:schemaRefs>
-    <ds:schemaRef ds:uri="http://schemas.microsoft.com/office/2006/metadata/properties"/>
-    <ds:schemaRef ds:uri="http://schemas.microsoft.com/office/infopath/2007/PartnerControls"/>
-  </ds:schemaRefs>
-</ds:datastoreItem>
+<file path=customXml/item3.xml><?xml version="1.0" encoding="utf-8"?>
+<p:properties xmlns:p="http://schemas.microsoft.com/office/2006/metadata/properties" xmlns:xsi="http://www.w3.org/2001/XMLSchema-instance" xmlns:pc="http://schemas.microsoft.com/office/infopath/2007/PartnerControls">
+  <documentManagement/>
+</p:properties>
 </file>
 
-<file path=customXml/itemProps3.xml><?xml version="1.0" encoding="utf-8"?>
-<ds:datastoreItem xmlns:ds="http://schemas.openxmlformats.org/officeDocument/2006/customXml" ds:itemID="{15811AAF-0749-43E5-AFC8-55EB4C161AC9}">
-  <ds:schemaRefs>
-    <ds:schemaRef ds:uri="http://schemas.openxmlformats.org/officeDocument/2006/bibliography"/>
-  </ds:schemaRefs>
-</ds:datastoreItem>
+<file path=customXml/item4.xml><?xml version="1.0" encoding="utf-8"?>
+<?mso-contentType ?>
+<FormTemplates xmlns="http://schemas.microsoft.com/sharepoint/v3/contenttype/forms">
+  <Display>DocumentLibraryForm</Display>
+  <Edit>DocumentLibraryForm</Edit>
+  <New>DocumentLibraryForm</New>
+</FormTemplates>
 </file>
 
-<file path=customXml/itemProps4.xml><?xml version="1.0" encoding="utf-8"?>
+<file path=customXml/itemProps1.xml><?xml version="1.0" encoding="utf-8"?>
 <ds:datastoreItem xmlns:ds="http://schemas.openxmlformats.org/officeDocument/2006/customXml" ds:itemID="{A81956BE-4781-44D7-9F66-92EA229A22F0}">
   <ds:schemaRefs>
     <ds:schemaRef ds:uri="http://schemas.microsoft.com/office/2006/metadata/contentType"/>
@@ -12271,4 +11953,29 @@
     <ds:schemaRef ds:uri="http://schemas.microsoft.com/internal/obd"/>
   </ds:schemaRefs>
 </ds:datastoreItem>
+</file>
+
+<file path=customXml/itemProps2.xml><?xml version="1.0" encoding="utf-8"?>
+<ds:datastoreItem xmlns:ds="http://schemas.openxmlformats.org/officeDocument/2006/customXml" ds:itemID="{15811AAF-0749-43E5-AFC8-55EB4C161AC9}">
+  <ds:schemaRefs>
+    <ds:schemaRef ds:uri="http://schemas.openxmlformats.org/officeDocument/2006/bibliography"/>
+  </ds:schemaRefs>
+</ds:datastoreItem>
+</file>
+
+<file path=customXml/itemProps3.xml><?xml version="1.0" encoding="utf-8"?>
+<ds:datastoreItem xmlns:ds="http://schemas.openxmlformats.org/officeDocument/2006/customXml" ds:itemID="{537FCB90-352A-4115-8519-7DBF373A0991}">
+  <ds:schemaRefs>
+    <ds:schemaRef ds:uri="http://schemas.microsoft.com/office/2006/metadata/properties"/>
+    <ds:schemaRef ds:uri="http://schemas.microsoft.com/office/infopath/2007/PartnerControls"/>
+  </ds:schemaRefs>
+</ds:datastoreItem>
+</file>
+
+<file path=customXml/itemProps4.xml><?xml version="1.0" encoding="utf-8"?>
+<ds:datastoreItem xmlns:ds="http://schemas.openxmlformats.org/officeDocument/2006/customXml" ds:itemID="{0276D1CE-9307-4AF3-A975-339D2B4EFB7C}">
+  <ds:schemaRefs>
+    <ds:schemaRef ds:uri="http://schemas.microsoft.com/sharepoint/v3/contenttype/forms"/>
+  </ds:schemaRefs>
+</ds:datastoreItem>
 </file>
</xml_diff>